<commit_message>
update of RDS-TMC standards
</commit_message>
<xml_diff>
--- a/extrakty/doc/TC278WG7/extract_22726-1_(2025).docx
+++ b/extrakty/doc/TC278WG7/extract_22726-1_(2025).docx
@@ -226,7 +226,23 @@
                 <w:sz w:val="28"/>
                 <w:szCs w:val="28"/>
               </w:rPr>
-              <w:t>Specifikace dynamických dat a mapové databáze pro aplikace připojených a automatizovaných systémů řízení</w:t>
+              <w:t>Specifikace dynamických dat a mapové databáze pro aplikace p</w:t>
+            </w:r>
+            <w:r>
+              <w:rPr>
+                <w:b/>
+                <w:sz w:val="28"/>
+                <w:szCs w:val="28"/>
+              </w:rPr>
+              <w:t>ro</w:t>
+            </w:r>
+            <w:r>
+              <w:rPr>
+                <w:b/>
+                <w:sz w:val="28"/>
+                <w:szCs w:val="28"/>
+              </w:rPr>
+              <w:t>pojených a automatizovaných systémů řízení</w:t>
             </w:r>
             <w:r>
               <w:rPr>

</xml_diff>